<commit_message>
chore: update Lab10 document and handle temporary file creation
</commit_message>
<xml_diff>
--- a/Lab10.docx
+++ b/Lab10.docx
@@ -12095,13 +12095,31 @@
           <w:ilvl w:val="0"/>
           <w:numId w:val="0"/>
         </w:numPr>
-        <w:jc w:val="both"/>
+        <w:jc w:val="left"/>
       </w:pPr>
       <w:r>
         <w:rPr>
           <w:rFonts w:ascii="Times New Roman" w:hAnsi="Times New Roman" w:cs="Times New Roman"/>
         </w:rPr>
         <w:lastRenderedPageBreak/>
+        <w:t>Link GITHUb</w:t>
+      </w:r>
+      <w:r>
+        <w:rPr>
+          <w:rFonts w:ascii="Times New Roman" w:hAnsi="Times New Roman" w:cs="Times New Roman"/>
+        </w:rPr>
+        <w:br/>
+      </w:r>
+      <w:r>
+        <w:rPr>
+          <w:rFonts w:ascii="Times New Roman" w:hAnsi="Times New Roman" w:cs="Times New Roman"/>
+        </w:rPr>
+        <w:br/>
+      </w:r>
+      <w:r>
+        <w:rPr>
+          <w:rFonts w:ascii="Times New Roman" w:hAnsi="Times New Roman" w:cs="Times New Roman"/>
+        </w:rPr>
         <w:t>TÀI LIỆU THAM KHẢO</w:t>
       </w:r>
     </w:p>

</xml_diff>